<commit_message>
all pipelines should be passing
</commit_message>
<xml_diff>
--- a/Documentation/Design Document - Hristo Ganchev.docx
+++ b/Documentation/Design Document - Hristo Ganchev.docx
@@ -83,7 +83,6 @@
           <w:lang w:val="en-US"/>
         </w:rPr>
       </w:pPr>
-      <w:proofErr w:type="spellStart"/>
       <w:r>
         <w:rPr>
           <w:b/>
@@ -94,7 +93,6 @@
         </w:rPr>
         <w:t>Ticketpass</w:t>
       </w:r>
-      <w:proofErr w:type="spellEnd"/>
     </w:p>
     <w:p>
       <w:pPr>
@@ -2695,23 +2693,21 @@
           <w:lang w:val="en-US"/>
         </w:rPr>
       </w:pPr>
-      <w:proofErr w:type="spellStart"/>
-      <w:r>
-        <w:rPr>
-          <w:sz w:val="28"/>
-          <w:szCs w:val="28"/>
-          <w:lang w:val="en-US"/>
-        </w:rPr>
-        <w:t>Ticketpass</w:t>
-      </w:r>
-      <w:proofErr w:type="spellEnd"/>
-      <w:r>
-        <w:rPr>
-          <w:sz w:val="28"/>
-          <w:szCs w:val="28"/>
-          <w:lang w:val="en-US"/>
-        </w:rPr>
-        <w:t xml:space="preserve"> is a platform that provides the user with a wide range of concerts. They can select a concert they would like to attend, purchase tickets for the selected event and gain access to it at the entrance of the venue.</w:t>
+      <w:r>
+        <w:rPr>
+          <w:sz w:val="28"/>
+          <w:szCs w:val="28"/>
+          <w:lang w:val="en-US"/>
+        </w:rPr>
+        <w:t>Ticketpass is a platform that provides the user with a wide range of concerts. They can select a concert they would like to attend, purchase tickets for the selected event and gain access to it at the entrance of the venue.</w:t>
+      </w:r>
+      <w:r>
+        <w:rPr>
+          <w:sz w:val="28"/>
+          <w:szCs w:val="28"/>
+          <w:lang w:val="en-US"/>
+        </w:rPr>
+        <w:t xml:space="preserve"> </w:t>
       </w:r>
     </w:p>
     <w:p>
@@ -2836,25 +2832,7 @@
           <w:szCs w:val="28"/>
           <w:lang w:val="en-US"/>
         </w:rPr>
-        <w:t xml:space="preserve">services/repositories throughout the application. The Single-Responsibility Principle and the YAGNI (You Aren’t </w:t>
-      </w:r>
-      <w:proofErr w:type="spellStart"/>
-      <w:r>
-        <w:rPr>
-          <w:sz w:val="28"/>
-          <w:szCs w:val="28"/>
-          <w:lang w:val="en-US"/>
-        </w:rPr>
-        <w:t>Gonna</w:t>
-      </w:r>
-      <w:proofErr w:type="spellEnd"/>
-      <w:r>
-        <w:rPr>
-          <w:sz w:val="28"/>
-          <w:szCs w:val="28"/>
-          <w:lang w:val="en-US"/>
-        </w:rPr>
-        <w:t xml:space="preserve"> Need It) Principle will also be followed.</w:t>
+        <w:t>services/repositories throughout the application. The Single-Responsibility Principle and the YAGNI (You Aren’t Gonna Need It) Principle will also be followed.</w:t>
       </w:r>
     </w:p>
     <w:p>
@@ -6418,25 +6396,7 @@
           <w:szCs w:val="28"/>
           <w:lang w:val="en-US"/>
         </w:rPr>
-        <w:t xml:space="preserve"> is implemented using Java Spring Boot. It is responsible for all the logic behind the application. It is separated into 4 different categories (User, Ticket, Order, Concert). Each category consists of a REST Controller that is responsible for managing the HTTP requests, a Service layer where </w:t>
-      </w:r>
-      <w:proofErr w:type="gramStart"/>
-      <w:r>
-        <w:rPr>
-          <w:sz w:val="28"/>
-          <w:szCs w:val="28"/>
-          <w:lang w:val="en-US"/>
-        </w:rPr>
-        <w:t>all of</w:t>
-      </w:r>
-      <w:proofErr w:type="gramEnd"/>
-      <w:r>
-        <w:rPr>
-          <w:sz w:val="28"/>
-          <w:szCs w:val="28"/>
-          <w:lang w:val="en-US"/>
-        </w:rPr>
-        <w:t xml:space="preserve"> the logic is managed, and a Repository that assists with the retrieval and updating of information to/from the database.</w:t>
+        <w:t xml:space="preserve"> is implemented using Java Spring Boot. It is responsible for all the logic behind the application. It is separated into 4 different categories (User, Ticket, Order, Concert). Each category consists of a REST Controller that is responsible for managing the HTTP requests, a Service layer where all of the logic is managed, and a Repository that assists with the retrieval and updating of information to/from the database.</w:t>
       </w:r>
     </w:p>
     <w:p>
@@ -6454,51 +6414,15 @@
           <w:szCs w:val="28"/>
           <w:lang w:val="en-US"/>
         </w:rPr>
-        <w:t xml:space="preserve">The database is where </w:t>
-      </w:r>
-      <w:proofErr w:type="gramStart"/>
-      <w:r>
-        <w:rPr>
-          <w:sz w:val="28"/>
-          <w:szCs w:val="28"/>
-          <w:lang w:val="en-US"/>
-        </w:rPr>
-        <w:t>all of</w:t>
-      </w:r>
-      <w:proofErr w:type="gramEnd"/>
-      <w:r>
-        <w:rPr>
-          <w:sz w:val="28"/>
-          <w:szCs w:val="28"/>
-          <w:lang w:val="en-US"/>
-        </w:rPr>
-        <w:t xml:space="preserve"> the information is store</w:t>
-      </w:r>
-      <w:r>
-        <w:rPr>
-          <w:sz w:val="28"/>
-          <w:szCs w:val="28"/>
-          <w:lang w:val="en-US"/>
-        </w:rPr>
-        <w:t xml:space="preserve">d. Measures will be taken </w:t>
-      </w:r>
-      <w:proofErr w:type="gramStart"/>
-      <w:r>
-        <w:rPr>
-          <w:sz w:val="28"/>
-          <w:szCs w:val="28"/>
-          <w:lang w:val="en-US"/>
-        </w:rPr>
-        <w:t>in order to</w:t>
-      </w:r>
-      <w:proofErr w:type="gramEnd"/>
-      <w:r>
-        <w:rPr>
-          <w:sz w:val="28"/>
-          <w:szCs w:val="28"/>
-          <w:lang w:val="en-US"/>
-        </w:rPr>
-        <w:t xml:space="preserve"> keep sensitive information (e.g. passwords) hidden in case of data leaks.</w:t>
+        <w:t>The database is where all of the information is store</w:t>
+      </w:r>
+      <w:r>
+        <w:rPr>
+          <w:sz w:val="28"/>
+          <w:szCs w:val="28"/>
+          <w:lang w:val="en-US"/>
+        </w:rPr>
+        <w:t>d. Measures will be taken in order to keep sensitive information (e.g. passwords) hidden in case of data leaks.</w:t>
       </w:r>
     </w:p>
     <w:p>
@@ -6526,51 +6450,15 @@
           <w:szCs w:val="28"/>
           <w:lang w:val="en-US"/>
         </w:rPr>
-        <w:t xml:space="preserve">The repository where the backend application is stored is connected to three CI Pipelines: build, test, and </w:t>
-      </w:r>
-      <w:proofErr w:type="spellStart"/>
-      <w:r>
-        <w:rPr>
-          <w:sz w:val="28"/>
-          <w:szCs w:val="28"/>
-          <w:lang w:val="en-US"/>
-        </w:rPr>
-        <w:t>sonarqube</w:t>
-      </w:r>
-      <w:proofErr w:type="spellEnd"/>
-      <w:r>
-        <w:rPr>
-          <w:sz w:val="28"/>
-          <w:szCs w:val="28"/>
-          <w:lang w:val="en-US"/>
-        </w:rPr>
-        <w:t xml:space="preserve">-check. </w:t>
-      </w:r>
-      <w:r>
-        <w:rPr>
-          <w:sz w:val="28"/>
-          <w:szCs w:val="28"/>
-          <w:lang w:val="en-US"/>
-        </w:rPr>
-        <w:t xml:space="preserve">If the pipeline prior to the current one fails, </w:t>
-      </w:r>
-      <w:proofErr w:type="gramStart"/>
-      <w:r>
-        <w:rPr>
-          <w:sz w:val="28"/>
-          <w:szCs w:val="28"/>
-          <w:lang w:val="en-US"/>
-        </w:rPr>
-        <w:t>all of</w:t>
-      </w:r>
-      <w:proofErr w:type="gramEnd"/>
-      <w:r>
-        <w:rPr>
-          <w:sz w:val="28"/>
-          <w:szCs w:val="28"/>
-          <w:lang w:val="en-US"/>
-        </w:rPr>
-        <w:t xml:space="preserve"> the other pipelines are skipped in order to not run faulty code.</w:t>
+        <w:t xml:space="preserve">The repository where the backend application is stored is connected to three CI Pipelines: build, test, and sonarqube-check. </w:t>
+      </w:r>
+      <w:r>
+        <w:rPr>
+          <w:sz w:val="28"/>
+          <w:szCs w:val="28"/>
+          <w:lang w:val="en-US"/>
+        </w:rPr>
+        <w:t>If the pipeline prior to the current one fails, all of the other pipelines are skipped in order to not run faulty code.</w:t>
       </w:r>
     </w:p>
     <w:p>
@@ -6607,25 +6495,7 @@
           <w:szCs w:val="28"/>
           <w:lang w:val="en-US"/>
         </w:rPr>
-        <w:t xml:space="preserve">The second pipeline is responsible for running the tests in the application. First, it compiles the application, and then runs </w:t>
-      </w:r>
-      <w:proofErr w:type="gramStart"/>
-      <w:r>
-        <w:rPr>
-          <w:sz w:val="28"/>
-          <w:szCs w:val="28"/>
-          <w:lang w:val="en-US"/>
-        </w:rPr>
-        <w:t>all of</w:t>
-      </w:r>
-      <w:proofErr w:type="gramEnd"/>
-      <w:r>
-        <w:rPr>
-          <w:sz w:val="28"/>
-          <w:szCs w:val="28"/>
-          <w:lang w:val="en-US"/>
-        </w:rPr>
-        <w:t xml:space="preserve"> the tests in the program. If at least one tests fails, the pipeline fails, too.</w:t>
+        <w:t>The second pipeline is responsible for running the tests in the application. First, it compiles the application, and then runs all of the tests in the program. If at least one tests fails, the pipeline fails, too.</w:t>
       </w:r>
     </w:p>
     <w:p>
@@ -6643,25 +6513,7 @@
           <w:szCs w:val="28"/>
           <w:lang w:val="en-US"/>
         </w:rPr>
-        <w:t xml:space="preserve">The last pipeline in the flow is </w:t>
-      </w:r>
-      <w:proofErr w:type="spellStart"/>
-      <w:r>
-        <w:rPr>
-          <w:sz w:val="28"/>
-          <w:szCs w:val="28"/>
-          <w:lang w:val="en-US"/>
-        </w:rPr>
-        <w:t>sonarqube</w:t>
-      </w:r>
-      <w:proofErr w:type="spellEnd"/>
-      <w:r>
-        <w:rPr>
-          <w:sz w:val="28"/>
-          <w:szCs w:val="28"/>
-          <w:lang w:val="en-US"/>
-        </w:rPr>
-        <w:t>-check. It will not run unless the application successfully compiles. It is responsible for giving more insight into the application. By “scanning” through the code, it recommends pieces of code being changed, which code blocks are duplicate, and what percentage of the application do the tests cover. It is only applied in branches, such as main and master.</w:t>
+        <w:t>The last pipeline in the flow is sonarqube-check. It will not run unless the application successfully compiles. It is responsible for giving more insight into the application. By “scanning” through the code, it recommends pieces of code being changed, which code blocks are duplicate, and what percentage of the application do the tests cover. It is only applied in branches, such as main and master.</w:t>
       </w:r>
     </w:p>
     <w:p>
@@ -6897,25 +6749,7 @@
           <w:szCs w:val="28"/>
           <w:lang w:val="en-US"/>
         </w:rPr>
-        <w:t xml:space="preserve"> For this purpose, </w:t>
-      </w:r>
-      <w:proofErr w:type="gramStart"/>
-      <w:r>
-        <w:rPr>
-          <w:sz w:val="28"/>
-          <w:szCs w:val="28"/>
-          <w:lang w:val="en-US"/>
-        </w:rPr>
-        <w:t>all of</w:t>
-      </w:r>
-      <w:proofErr w:type="gramEnd"/>
-      <w:r>
-        <w:rPr>
-          <w:sz w:val="28"/>
-          <w:szCs w:val="28"/>
-          <w:lang w:val="en-US"/>
-        </w:rPr>
-        <w:t xml:space="preserve"> the </w:t>
+        <w:t xml:space="preserve"> For this purpose, all of the </w:t>
       </w:r>
       <w:r>
         <w:rPr>
@@ -6994,25 +6828,7 @@
           <w:szCs w:val="28"/>
           <w:lang w:val="en-US"/>
         </w:rPr>
-        <w:t xml:space="preserve">For instance, in a filter statement, instead of writing a keyword, the attacker can write an SQL statement such as “DROP TABLE orders”, which, if not used in a parameterized query, will be read as an SQL </w:t>
-      </w:r>
-      <w:proofErr w:type="gramStart"/>
-      <w:r>
-        <w:rPr>
-          <w:sz w:val="28"/>
-          <w:szCs w:val="28"/>
-          <w:lang w:val="en-US"/>
-        </w:rPr>
-        <w:t>statement</w:t>
-      </w:r>
-      <w:proofErr w:type="gramEnd"/>
-      <w:r>
-        <w:rPr>
-          <w:sz w:val="28"/>
-          <w:szCs w:val="28"/>
-          <w:lang w:val="en-US"/>
-        </w:rPr>
-        <w:t xml:space="preserve"> and executed. </w:t>
+        <w:t xml:space="preserve">For instance, in a filter statement, instead of writing a keyword, the attacker can write an SQL statement such as “DROP TABLE orders”, which, if not used in a parameterized query, will be read as an SQL statement and executed. </w:t>
       </w:r>
       <w:r>
         <w:rPr>
@@ -7131,25 +6947,7 @@
           <w:szCs w:val="28"/>
           <w:lang w:val="en-US"/>
         </w:rPr>
-        <w:t xml:space="preserve"> If proper security controls are not created in the application, it is vulnerable to attacks. However, the security of the product is taken into consideration, and measures are taken to protect the website. One example is the generation of access tokens. </w:t>
-      </w:r>
-      <w:proofErr w:type="gramStart"/>
-      <w:r>
-        <w:rPr>
-          <w:sz w:val="28"/>
-          <w:szCs w:val="28"/>
-          <w:lang w:val="en-US"/>
-        </w:rPr>
-        <w:t>In order to</w:t>
-      </w:r>
-      <w:proofErr w:type="gramEnd"/>
-      <w:r>
-        <w:rPr>
-          <w:sz w:val="28"/>
-          <w:szCs w:val="28"/>
-          <w:lang w:val="en-US"/>
-        </w:rPr>
-        <w:t xml:space="preserve"> encode a token, a signature key is used. The key is stored in an .env file outside of the repository, meaning that only the website owner has access to it, and no one else. Other measures are the hashing of passwords, parameterized queries, methods accessible only to authorized users, and ID checks.</w:t>
+        <w:t xml:space="preserve"> If proper security controls are not created in the application, it is vulnerable to attacks. However, the security of the product is taken into consideration, and measures are taken to protect the website. One example is the generation of access tokens. In order to encode a token, a signature key is used. The key is stored in an .env file outside of the repository, meaning that only the website owner has access to it, and no one else. Other measures are the hashing of passwords, parameterized queries, methods accessible only to authorized users, and ID checks.</w:t>
       </w:r>
     </w:p>
     <w:p>
@@ -7444,25 +7242,7 @@
           <w:szCs w:val="28"/>
           <w:lang w:val="en-US"/>
         </w:rPr>
-        <w:t xml:space="preserve">After certainty that a following component is still supported, secure, and </w:t>
-      </w:r>
-      <w:proofErr w:type="gramStart"/>
-      <w:r>
-        <w:rPr>
-          <w:sz w:val="28"/>
-          <w:szCs w:val="28"/>
-          <w:lang w:val="en-US"/>
-        </w:rPr>
-        <w:t>up-to-date</w:t>
-      </w:r>
-      <w:proofErr w:type="gramEnd"/>
-      <w:r>
-        <w:rPr>
-          <w:sz w:val="28"/>
-          <w:szCs w:val="28"/>
-          <w:lang w:val="en-US"/>
-        </w:rPr>
-        <w:t xml:space="preserve">, it can safely be used in the application. </w:t>
+        <w:t xml:space="preserve">After certainty that a following component is still supported, secure, and up-to-date, it can safely be used in the application. </w:t>
       </w:r>
       <w:r>
         <w:rPr>
@@ -7604,25 +7384,7 @@
           <w:szCs w:val="28"/>
           <w:lang w:val="en-US"/>
         </w:rPr>
-        <w:t xml:space="preserve"> caused by plugins, </w:t>
-      </w:r>
-      <w:proofErr w:type="gramStart"/>
-      <w:r>
-        <w:rPr>
-          <w:sz w:val="28"/>
-          <w:szCs w:val="28"/>
-          <w:lang w:val="en-US"/>
-        </w:rPr>
-        <w:t>libraries</w:t>
-      </w:r>
-      <w:proofErr w:type="gramEnd"/>
-      <w:r>
-        <w:rPr>
-          <w:sz w:val="28"/>
-          <w:szCs w:val="28"/>
-          <w:lang w:val="en-US"/>
-        </w:rPr>
-        <w:t xml:space="preserve"> or modules from untrusted sources, which use insecure update mechanisms, or insecure deserialization. </w:t>
+        <w:t xml:space="preserve"> caused by plugins, libraries or modules from untrusted sources, which use insecure update mechanisms, or insecure deserialization. </w:t>
       </w:r>
       <w:r>
         <w:rPr>
@@ -7638,25 +7400,7 @@
           <w:szCs w:val="28"/>
           <w:lang w:val="en-US"/>
         </w:rPr>
-        <w:t xml:space="preserve">This is why only popular libraries are </w:t>
-      </w:r>
-      <w:proofErr w:type="gramStart"/>
-      <w:r>
-        <w:rPr>
-          <w:sz w:val="28"/>
-          <w:szCs w:val="28"/>
-          <w:lang w:val="en-US"/>
-        </w:rPr>
-        <w:t>used, since</w:t>
-      </w:r>
-      <w:proofErr w:type="gramEnd"/>
-      <w:r>
-        <w:rPr>
-          <w:sz w:val="28"/>
-          <w:szCs w:val="28"/>
-          <w:lang w:val="en-US"/>
-        </w:rPr>
-        <w:t xml:space="preserve"> they are considered to be more secure against such circumstances.</w:t>
+        <w:t>This is why only popular libraries are used, since they are considered to be more secure against such circumstances.</w:t>
       </w:r>
       <w:r>
         <w:rPr>
@@ -7744,25 +7488,7 @@
           <w:szCs w:val="28"/>
           <w:lang w:val="en-US"/>
         </w:rPr>
-        <w:t xml:space="preserve">Logs can notify an administrator that a user is conducting a suspicious activity or transaction, and from then </w:t>
-      </w:r>
-      <w:proofErr w:type="gramStart"/>
-      <w:r>
-        <w:rPr>
-          <w:sz w:val="28"/>
-          <w:szCs w:val="28"/>
-          <w:lang w:val="en-US"/>
-        </w:rPr>
-        <w:t>on</w:t>
-      </w:r>
-      <w:proofErr w:type="gramEnd"/>
-      <w:r>
-        <w:rPr>
-          <w:sz w:val="28"/>
-          <w:szCs w:val="28"/>
-          <w:lang w:val="en-US"/>
-        </w:rPr>
-        <w:t xml:space="preserve"> they may take action. At the current point in time</w:t>
+        <w:t>Logs can notify an administrator that a user is conducting a suspicious activity or transaction, and from then on they may take action. At the current point in time</w:t>
       </w:r>
       <w:r>
         <w:rPr>
@@ -7778,25 +7504,7 @@
           <w:szCs w:val="28"/>
           <w:lang w:val="en-US"/>
         </w:rPr>
-        <w:t xml:space="preserve"> </w:t>
-      </w:r>
-      <w:proofErr w:type="gramStart"/>
-      <w:r>
-        <w:rPr>
-          <w:sz w:val="28"/>
-          <w:szCs w:val="28"/>
-          <w:lang w:val="en-US"/>
-        </w:rPr>
-        <w:t>In the near future</w:t>
-      </w:r>
-      <w:proofErr w:type="gramEnd"/>
-      <w:r>
-        <w:rPr>
-          <w:sz w:val="28"/>
-          <w:szCs w:val="28"/>
-          <w:lang w:val="en-US"/>
-        </w:rPr>
-        <w:t>, security logging may be considered.</w:t>
+        <w:t xml:space="preserve"> In the near future, security logging may be considered.</w:t>
       </w:r>
     </w:p>
     <w:p>
@@ -7877,23 +7585,13 @@
         </w:rPr>
         <w:t xml:space="preserve"> (e.g. a fake banking website that is a perfect copy of a legit one) and therefore scam website users into entering their credentials, from which the attacker can gain access to their accounts in the real platforms. Some of the recommended solutions to this security risk are using HTTPS configuration and scanning URL links for potential threats. </w:t>
       </w:r>
-      <w:proofErr w:type="gramStart"/>
-      <w:r>
-        <w:rPr>
-          <w:sz w:val="28"/>
-          <w:szCs w:val="28"/>
-          <w:lang w:val="en-US"/>
-        </w:rPr>
-        <w:t>At the moment</w:t>
-      </w:r>
-      <w:proofErr w:type="gramEnd"/>
-      <w:r>
-        <w:rPr>
-          <w:sz w:val="28"/>
-          <w:szCs w:val="28"/>
-          <w:lang w:val="en-US"/>
-        </w:rPr>
-        <w:t>, no firewall preventing such attacks is present in the application</w:t>
+      <w:r>
+        <w:rPr>
+          <w:sz w:val="28"/>
+          <w:szCs w:val="28"/>
+          <w:lang w:val="en-US"/>
+        </w:rPr>
+        <w:t>At the moment, no firewall preventing such attacks is present in the application</w:t>
       </w:r>
       <w:r>
         <w:rPr>
@@ -8001,25 +7699,7 @@
           <w:szCs w:val="28"/>
           <w:lang w:val="en-US"/>
         </w:rPr>
-        <w:t xml:space="preserve"> is only using parameterized queries, making SQL Injection more difficult to be executed. However, the application is planning to transfer from HTTP to HTTPS </w:t>
-      </w:r>
-      <w:proofErr w:type="gramStart"/>
-      <w:r>
-        <w:rPr>
-          <w:sz w:val="28"/>
-          <w:szCs w:val="28"/>
-          <w:lang w:val="en-US"/>
-        </w:rPr>
-        <w:t>in the near future</w:t>
-      </w:r>
-      <w:proofErr w:type="gramEnd"/>
-      <w:r>
-        <w:rPr>
-          <w:sz w:val="28"/>
-          <w:szCs w:val="28"/>
-          <w:lang w:val="en-US"/>
-        </w:rPr>
-        <w:t xml:space="preserve">, as well as taking into account </w:t>
+        <w:t xml:space="preserve"> is only using parameterized queries, making SQL Injection more difficult to be executed. However, the application is planning to transfer from HTTP to HTTPS in the near future, as well as taking into account </w:t>
       </w:r>
       <w:r>
         <w:rPr>
@@ -8326,21 +8006,8 @@
           <w:lang w:val="en-US" w:eastAsia="en-US"/>
           <w14:ligatures w14:val="standardContextual"/>
         </w:rPr>
-        <w:t xml:space="preserve">A method that adds concerts to the database should be </w:t>
-      </w:r>
-      <w:proofErr w:type="gramStart"/>
-      <w:r>
-        <w:rPr>
-          <w:rFonts w:asciiTheme="minorHAnsi" w:eastAsiaTheme="minorHAnsi" w:hAnsiTheme="minorHAnsi" w:cstheme="minorBidi"/>
-          <w:kern w:val="2"/>
-          <w:sz w:val="28"/>
-          <w:szCs w:val="28"/>
-          <w:lang w:val="en-US" w:eastAsia="en-US"/>
-          <w14:ligatures w14:val="standardContextual"/>
-        </w:rPr>
-        <w:t>implemented</w:t>
-      </w:r>
-      <w:proofErr w:type="gramEnd"/>
+        <w:t>A method that adds concerts to the database should be implemented</w:t>
+      </w:r>
     </w:p>
     <w:p>
       <w:pPr>
@@ -8435,21 +8102,8 @@
           <w:lang w:val="en-US" w:eastAsia="en-US"/>
           <w14:ligatures w14:val="standardContextual"/>
         </w:rPr>
-        <w:t xml:space="preserve">A page where concerts are retrieved from a database should be </w:t>
-      </w:r>
-      <w:proofErr w:type="gramStart"/>
-      <w:r>
-        <w:rPr>
-          <w:rFonts w:asciiTheme="minorHAnsi" w:eastAsiaTheme="minorHAnsi" w:hAnsiTheme="minorHAnsi" w:cstheme="minorBidi"/>
-          <w:kern w:val="2"/>
-          <w:sz w:val="28"/>
-          <w:szCs w:val="28"/>
-          <w:lang w:val="en-US" w:eastAsia="en-US"/>
-          <w14:ligatures w14:val="standardContextual"/>
-        </w:rPr>
-        <w:t>created</w:t>
-      </w:r>
-      <w:proofErr w:type="gramEnd"/>
+        <w:t>A page where concerts are retrieved from a database should be created</w:t>
+      </w:r>
     </w:p>
     <w:p>
       <w:pPr>
@@ -8476,21 +8130,8 @@
           <w:lang w:val="en-US" w:eastAsia="en-US"/>
           <w14:ligatures w14:val="standardContextual"/>
         </w:rPr>
-        <w:t xml:space="preserve">Each concert should be displayed with their name, photo, and description in the “Concerts” </w:t>
-      </w:r>
-      <w:proofErr w:type="gramStart"/>
-      <w:r>
-        <w:rPr>
-          <w:rFonts w:asciiTheme="minorHAnsi" w:eastAsiaTheme="minorHAnsi" w:hAnsiTheme="minorHAnsi" w:cstheme="minorBidi"/>
-          <w:kern w:val="2"/>
-          <w:sz w:val="28"/>
-          <w:szCs w:val="28"/>
-          <w:lang w:val="en-US" w:eastAsia="en-US"/>
-          <w14:ligatures w14:val="standardContextual"/>
-        </w:rPr>
-        <w:t>page</w:t>
-      </w:r>
-      <w:proofErr w:type="gramEnd"/>
+        <w:t>Each concert should be displayed with their name, photo, and description in the “Concerts” page</w:t>
+      </w:r>
     </w:p>
     <w:p>
       <w:pPr>
@@ -8760,31 +8401,7 @@
           <w:lang w:val="en-US" w:eastAsia="en-US"/>
           <w14:ligatures w14:val="standardContextual"/>
         </w:rPr>
-        <w:t xml:space="preserve">As an administrator, I want to have all of my </w:t>
-      </w:r>
-      <w:proofErr w:type="gramStart"/>
-      <w:r>
-        <w:rPr>
-          <w:rFonts w:asciiTheme="minorHAnsi" w:eastAsiaTheme="minorHAnsi" w:hAnsiTheme="minorHAnsi" w:cstheme="minorBidi"/>
-          <w:kern w:val="2"/>
-          <w:sz w:val="28"/>
-          <w:szCs w:val="28"/>
-          <w:lang w:val="en-US" w:eastAsia="en-US"/>
-          <w14:ligatures w14:val="standardContextual"/>
-        </w:rPr>
-        <w:t>users</w:t>
-      </w:r>
-      <w:proofErr w:type="gramEnd"/>
-      <w:r>
-        <w:rPr>
-          <w:rFonts w:asciiTheme="minorHAnsi" w:eastAsiaTheme="minorHAnsi" w:hAnsiTheme="minorHAnsi" w:cstheme="minorBidi"/>
-          <w:kern w:val="2"/>
-          <w:sz w:val="28"/>
-          <w:szCs w:val="28"/>
-          <w:lang w:val="en-US" w:eastAsia="en-US"/>
-          <w14:ligatures w14:val="standardContextual"/>
-        </w:rPr>
-        <w:t xml:space="preserve"> passwords hashed, so that in case of a data leak their personal information will not be available to the public.</w:t>
+        <w:t>As an administrator, I want to have all of my users passwords hashed, so that in case of a data leak their personal information will not be available to the public.</w:t>
       </w:r>
     </w:p>
     <w:p>
@@ -8904,21 +8521,8 @@
           <w:lang w:val="en-US" w:eastAsia="en-US"/>
           <w14:ligatures w14:val="standardContextual"/>
         </w:rPr>
-        <w:t xml:space="preserve">Create a method for generating an access </w:t>
-      </w:r>
-      <w:proofErr w:type="gramStart"/>
-      <w:r>
-        <w:rPr>
-          <w:rFonts w:asciiTheme="minorHAnsi" w:eastAsiaTheme="minorHAnsi" w:hAnsiTheme="minorHAnsi" w:cstheme="minorBidi"/>
-          <w:kern w:val="2"/>
-          <w:sz w:val="28"/>
-          <w:szCs w:val="28"/>
-          <w:lang w:val="en-US" w:eastAsia="en-US"/>
-          <w14:ligatures w14:val="standardContextual"/>
-        </w:rPr>
-        <w:t>token</w:t>
-      </w:r>
-      <w:proofErr w:type="gramEnd"/>
+        <w:t>Create a method for generating an access token</w:t>
+      </w:r>
     </w:p>
     <w:p>
       <w:pPr>
@@ -9009,31 +8613,7 @@
           <w:lang w:val="en-US" w:eastAsia="en-US"/>
           <w14:ligatures w14:val="standardContextual"/>
         </w:rPr>
-        <w:t xml:space="preserve">As a user, I want to be able to see </w:t>
-      </w:r>
-      <w:proofErr w:type="gramStart"/>
-      <w:r>
-        <w:rPr>
-          <w:rFonts w:asciiTheme="minorHAnsi" w:eastAsiaTheme="minorHAnsi" w:hAnsiTheme="minorHAnsi" w:cstheme="minorBidi"/>
-          <w:kern w:val="2"/>
-          <w:sz w:val="28"/>
-          <w:szCs w:val="28"/>
-          <w:lang w:val="en-US" w:eastAsia="en-US"/>
-          <w14:ligatures w14:val="standardContextual"/>
-        </w:rPr>
-        <w:t>all of</w:t>
-      </w:r>
-      <w:proofErr w:type="gramEnd"/>
-      <w:r>
-        <w:rPr>
-          <w:rFonts w:asciiTheme="minorHAnsi" w:eastAsiaTheme="minorHAnsi" w:hAnsiTheme="minorHAnsi" w:cstheme="minorBidi"/>
-          <w:kern w:val="2"/>
-          <w:sz w:val="28"/>
-          <w:szCs w:val="28"/>
-          <w:lang w:val="en-US" w:eastAsia="en-US"/>
-          <w14:ligatures w14:val="standardContextual"/>
-        </w:rPr>
-        <w:t xml:space="preserve"> my tickets for a specific concert in one place, so that it is easier for me and my friends to show them at the entrance of the venue. </w:t>
+        <w:t xml:space="preserve">As a user, I want to be able to see all of my tickets for a specific concert in one place, so that it is easier for me and my friends to show them at the entrance of the venue. </w:t>
       </w:r>
     </w:p>
     <w:p>
@@ -9063,21 +8643,8 @@
           <w:lang w:val="en-US" w:eastAsia="en-US"/>
           <w14:ligatures w14:val="standardContextual"/>
         </w:rPr>
-        <w:t xml:space="preserve">A “Tickets” page should be </w:t>
-      </w:r>
-      <w:proofErr w:type="gramStart"/>
-      <w:r>
-        <w:rPr>
-          <w:rFonts w:asciiTheme="minorHAnsi" w:eastAsiaTheme="minorHAnsi" w:hAnsiTheme="minorHAnsi" w:cstheme="minorBidi"/>
-          <w:kern w:val="2"/>
-          <w:sz w:val="28"/>
-          <w:szCs w:val="28"/>
-          <w:lang w:val="en-US" w:eastAsia="en-US"/>
-          <w14:ligatures w14:val="standardContextual"/>
-        </w:rPr>
-        <w:t>created</w:t>
-      </w:r>
-      <w:proofErr w:type="gramEnd"/>
+        <w:t>A “Tickets” page should be created</w:t>
+      </w:r>
     </w:p>
     <w:p>
       <w:pPr>
@@ -9106,21 +8673,8 @@
           <w:lang w:val="en-US" w:eastAsia="en-US"/>
           <w14:ligatures w14:val="standardContextual"/>
         </w:rPr>
-        <w:t xml:space="preserve">All tickets should be stored in the </w:t>
-      </w:r>
-      <w:proofErr w:type="gramStart"/>
-      <w:r>
-        <w:rPr>
-          <w:rFonts w:asciiTheme="minorHAnsi" w:eastAsiaTheme="minorHAnsi" w:hAnsiTheme="minorHAnsi" w:cstheme="minorBidi"/>
-          <w:kern w:val="2"/>
-          <w:sz w:val="28"/>
-          <w:szCs w:val="28"/>
-          <w:lang w:val="en-US" w:eastAsia="en-US"/>
-          <w14:ligatures w14:val="standardContextual"/>
-        </w:rPr>
-        <w:t>database</w:t>
-      </w:r>
-      <w:proofErr w:type="gramEnd"/>
+        <w:t>All tickets should be stored in the database</w:t>
+      </w:r>
     </w:p>
     <w:p>
       <w:pPr>
@@ -9149,31 +8703,7 @@
           <w:lang w:val="en-US" w:eastAsia="en-US"/>
           <w14:ligatures w14:val="standardContextual"/>
         </w:rPr>
-        <w:t xml:space="preserve">Each ticket that is equal to a specific order ID should be displayed on the page with </w:t>
-      </w:r>
-      <w:proofErr w:type="gramStart"/>
-      <w:r>
-        <w:rPr>
-          <w:rFonts w:asciiTheme="minorHAnsi" w:eastAsiaTheme="minorHAnsi" w:hAnsiTheme="minorHAnsi" w:cstheme="minorBidi"/>
-          <w:kern w:val="2"/>
-          <w:sz w:val="28"/>
-          <w:szCs w:val="28"/>
-          <w:lang w:val="en-US" w:eastAsia="en-US"/>
-          <w14:ligatures w14:val="standardContextual"/>
-        </w:rPr>
-        <w:t>an</w:t>
-      </w:r>
-      <w:proofErr w:type="gramEnd"/>
-      <w:r>
-        <w:rPr>
-          <w:rFonts w:asciiTheme="minorHAnsi" w:eastAsiaTheme="minorHAnsi" w:hAnsiTheme="minorHAnsi" w:cstheme="minorBidi"/>
-          <w:kern w:val="2"/>
-          <w:sz w:val="28"/>
-          <w:szCs w:val="28"/>
-          <w:lang w:val="en-US" w:eastAsia="en-US"/>
-          <w14:ligatures w14:val="standardContextual"/>
-        </w:rPr>
-        <w:t xml:space="preserve"> unique QR code</w:t>
+        <w:t>Each ticket that is equal to a specific order ID should be displayed on the page with an unique QR code</w:t>
       </w:r>
     </w:p>
     <w:p>
@@ -9275,21 +8805,8 @@
           <w:lang w:val="en-US" w:eastAsia="en-US"/>
           <w14:ligatures w14:val="standardContextual"/>
         </w:rPr>
-        <w:t xml:space="preserve">All orders made by all users should be displayed in the “All orders” </w:t>
-      </w:r>
-      <w:proofErr w:type="gramStart"/>
-      <w:r>
-        <w:rPr>
-          <w:rFonts w:asciiTheme="minorHAnsi" w:eastAsiaTheme="minorHAnsi" w:hAnsiTheme="minorHAnsi" w:cstheme="minorBidi"/>
-          <w:kern w:val="2"/>
-          <w:sz w:val="28"/>
-          <w:szCs w:val="28"/>
-          <w:lang w:val="en-US" w:eastAsia="en-US"/>
-          <w14:ligatures w14:val="standardContextual"/>
-        </w:rPr>
-        <w:t>page</w:t>
-      </w:r>
-      <w:proofErr w:type="gramEnd"/>
+        <w:t>All orders made by all users should be displayed in the “All orders” page</w:t>
+      </w:r>
     </w:p>
     <w:p>
       <w:pPr>
@@ -9440,21 +8957,8 @@
           <w:lang w:val="en-US" w:eastAsia="en-US"/>
           <w14:ligatures w14:val="standardContextual"/>
         </w:rPr>
-        <w:t xml:space="preserve">Make a method that updates the required fields of the selected concert with newly provided </w:t>
-      </w:r>
-      <w:proofErr w:type="gramStart"/>
-      <w:r>
-        <w:rPr>
-          <w:rFonts w:asciiTheme="minorHAnsi" w:eastAsiaTheme="minorHAnsi" w:hAnsiTheme="minorHAnsi" w:cstheme="minorBidi"/>
-          <w:kern w:val="2"/>
-          <w:sz w:val="28"/>
-          <w:szCs w:val="28"/>
-          <w:lang w:val="en-US" w:eastAsia="en-US"/>
-          <w14:ligatures w14:val="standardContextual"/>
-        </w:rPr>
-        <w:t>information</w:t>
-      </w:r>
-      <w:proofErr w:type="gramEnd"/>
+        <w:t>Make a method that updates the required fields of the selected concert with newly provided information</w:t>
+      </w:r>
     </w:p>
     <w:p>
       <w:pPr>
@@ -9497,31 +9001,7 @@
           <w:lang w:val="en-US" w:eastAsia="en-US"/>
           <w14:ligatures w14:val="standardContextual"/>
         </w:rPr>
-        <w:t xml:space="preserve">As a user, I want to be able to search for specific genres, </w:t>
-      </w:r>
-      <w:proofErr w:type="gramStart"/>
-      <w:r>
-        <w:rPr>
-          <w:rFonts w:asciiTheme="minorHAnsi" w:eastAsiaTheme="minorHAnsi" w:hAnsiTheme="minorHAnsi" w:cstheme="minorBidi"/>
-          <w:kern w:val="2"/>
-          <w:sz w:val="28"/>
-          <w:szCs w:val="28"/>
-          <w:lang w:val="en-US" w:eastAsia="en-US"/>
-          <w14:ligatures w14:val="standardContextual"/>
-        </w:rPr>
-        <w:t>cities</w:t>
-      </w:r>
-      <w:proofErr w:type="gramEnd"/>
-      <w:r>
-        <w:rPr>
-          <w:rFonts w:asciiTheme="minorHAnsi" w:eastAsiaTheme="minorHAnsi" w:hAnsiTheme="minorHAnsi" w:cstheme="minorBidi"/>
-          <w:kern w:val="2"/>
-          <w:sz w:val="28"/>
-          <w:szCs w:val="28"/>
-          <w:lang w:val="en-US" w:eastAsia="en-US"/>
-          <w14:ligatures w14:val="standardContextual"/>
-        </w:rPr>
-        <w:t xml:space="preserve"> or artists, so that I know whether an artist I might like is performing in my area.</w:t>
+        <w:t>As a user, I want to be able to search for specific genres, cities or artists, so that I know whether an artist I might like is performing in my area.</w:t>
       </w:r>
     </w:p>
     <w:p>
@@ -9550,21 +9030,8 @@
           <w:lang w:val="en-US" w:eastAsia="en-US"/>
           <w14:ligatures w14:val="standardContextual"/>
         </w:rPr>
-        <w:t xml:space="preserve">An algorithm that filters concerts based on provided genre, city or artist should be </w:t>
-      </w:r>
-      <w:proofErr w:type="gramStart"/>
-      <w:r>
-        <w:rPr>
-          <w:rFonts w:asciiTheme="minorHAnsi" w:eastAsiaTheme="minorHAnsi" w:hAnsiTheme="minorHAnsi" w:cstheme="minorBidi"/>
-          <w:kern w:val="2"/>
-          <w:sz w:val="28"/>
-          <w:szCs w:val="28"/>
-          <w:lang w:val="en-US" w:eastAsia="en-US"/>
-          <w14:ligatures w14:val="standardContextual"/>
-        </w:rPr>
-        <w:t>created</w:t>
-      </w:r>
-      <w:proofErr w:type="gramEnd"/>
+        <w:t>An algorithm that filters concerts based on provided genre, city or artist should be created</w:t>
+      </w:r>
     </w:p>
     <w:p>
       <w:pPr>
@@ -9592,21 +9059,8 @@
           <w:lang w:val="en-US" w:eastAsia="en-US"/>
           <w14:ligatures w14:val="standardContextual"/>
         </w:rPr>
-        <w:t xml:space="preserve">Only the filtered concerts must be displayed in the “Concerts” </w:t>
-      </w:r>
-      <w:proofErr w:type="gramStart"/>
-      <w:r>
-        <w:rPr>
-          <w:rFonts w:asciiTheme="minorHAnsi" w:eastAsiaTheme="minorHAnsi" w:hAnsiTheme="minorHAnsi" w:cstheme="minorBidi"/>
-          <w:kern w:val="2"/>
-          <w:sz w:val="28"/>
-          <w:szCs w:val="28"/>
-          <w:lang w:val="en-US" w:eastAsia="en-US"/>
-          <w14:ligatures w14:val="standardContextual"/>
-        </w:rPr>
-        <w:t>page</w:t>
-      </w:r>
-      <w:proofErr w:type="gramEnd"/>
+        <w:t>Only the filtered concerts must be displayed in the “Concerts” page</w:t>
+      </w:r>
     </w:p>
     <w:p>
       <w:pPr>
@@ -9682,25 +9136,7 @@
           <w:szCs w:val="28"/>
           <w:lang w:val="en-US"/>
         </w:rPr>
-        <w:t xml:space="preserve">As a user, I want to see </w:t>
-      </w:r>
-      <w:proofErr w:type="gramStart"/>
-      <w:r>
-        <w:rPr>
-          <w:sz w:val="28"/>
-          <w:szCs w:val="28"/>
-          <w:lang w:val="en-US"/>
-        </w:rPr>
-        <w:t>all of</w:t>
-      </w:r>
-      <w:proofErr w:type="gramEnd"/>
-      <w:r>
-        <w:rPr>
-          <w:sz w:val="28"/>
-          <w:szCs w:val="28"/>
-          <w:lang w:val="en-US"/>
-        </w:rPr>
-        <w:t xml:space="preserve"> my previous and upcoming orders, so that I know which concerts exactly I have been to and which ones I am going to next. </w:t>
+        <w:t xml:space="preserve">As a user, I want to see all of my previous and upcoming orders, so that I know which concerts exactly I have been to and which ones I am going to next. </w:t>
       </w:r>
     </w:p>
     <w:p>
@@ -9744,18 +9180,8 @@
           <w:szCs w:val="28"/>
           <w:lang w:val="en-US"/>
         </w:rPr>
-        <w:t xml:space="preserve">“Upcoming concerts” and “Previous concerts” pages should be </w:t>
-      </w:r>
-      <w:proofErr w:type="gramStart"/>
-      <w:r>
-        <w:rPr>
-          <w:sz w:val="28"/>
-          <w:szCs w:val="28"/>
-          <w:lang w:val="en-US"/>
-        </w:rPr>
-        <w:t>implemented</w:t>
-      </w:r>
-      <w:proofErr w:type="gramEnd"/>
+        <w:t>“Upcoming concerts” and “Previous concerts” pages should be implemented</w:t>
+      </w:r>
     </w:p>
     <w:p>
       <w:pPr>
@@ -9776,18 +9202,8 @@
           <w:szCs w:val="28"/>
           <w:lang w:val="en-US"/>
         </w:rPr>
-        <w:t xml:space="preserve">Concerts should be displayed in each page </w:t>
-      </w:r>
-      <w:proofErr w:type="gramStart"/>
-      <w:r>
-        <w:rPr>
-          <w:sz w:val="28"/>
-          <w:szCs w:val="28"/>
-          <w:lang w:val="en-US"/>
-        </w:rPr>
-        <w:t>accordingly</w:t>
-      </w:r>
-      <w:proofErr w:type="gramEnd"/>
+        <w:t>Concerts should be displayed in each page accordingly</w:t>
+      </w:r>
     </w:p>
     <w:p>
       <w:pPr>
@@ -9843,25 +9259,7 @@
           <w:szCs w:val="28"/>
           <w:lang w:val="en-US"/>
         </w:rPr>
-        <w:t xml:space="preserve">After a concert is updated, </w:t>
-      </w:r>
-      <w:proofErr w:type="gramStart"/>
-      <w:r>
-        <w:rPr>
-          <w:sz w:val="28"/>
-          <w:szCs w:val="28"/>
-          <w:lang w:val="en-US"/>
-        </w:rPr>
-        <w:t>all of</w:t>
-      </w:r>
-      <w:proofErr w:type="gramEnd"/>
-      <w:r>
-        <w:rPr>
-          <w:sz w:val="28"/>
-          <w:szCs w:val="28"/>
-          <w:lang w:val="en-US"/>
-        </w:rPr>
-        <w:t xml:space="preserve"> the tickets for the concert should also be updated.</w:t>
+        <w:t>After a concert is updated, all of the tickets for the concert should also be updated.</w:t>
       </w:r>
     </w:p>
     <w:p>
@@ -9883,18 +9281,8 @@
           <w:szCs w:val="28"/>
           <w:lang w:val="en-US"/>
         </w:rPr>
-        <w:t xml:space="preserve">A system for sending real-time notifications should be </w:t>
-      </w:r>
-      <w:proofErr w:type="gramStart"/>
-      <w:r>
-        <w:rPr>
-          <w:sz w:val="28"/>
-          <w:szCs w:val="28"/>
-          <w:lang w:val="en-US"/>
-        </w:rPr>
-        <w:t>implemented</w:t>
-      </w:r>
-      <w:proofErr w:type="gramEnd"/>
+        <w:t>A system for sending real-time notifications should be implemented</w:t>
+      </w:r>
     </w:p>
     <w:p>
       <w:pPr>

</xml_diff>